<commit_message>
Agregar conclusiones y sección sobre uso de IA en Tarea 2
</commit_message>
<xml_diff>
--- a/Tarea 2/Guanga_Daniel_AnaDisSis_U2.docx
+++ b/Tarea 2/Guanga_Daniel_AnaDisSis_U2.docx
@@ -2990,6 +2990,67 @@
         <w:t>UMG Admon C. (2008). Lección No. 52. https://umgadmonc.wordpress.com/wp-content/uploads/2008/06/leccion_no_52.pdf</w:t>
       </w:r>
     </w:p>
+    <w:p>
+      <w:r>
+        <w:br w:type="page"/>
+      </w:r>
+    </w:p>
+    <w:p>
+      <w:pPr>
+        <w:pStyle w:val="Ttulo1"/>
+      </w:pPr>
+      <w:r>
+        <w:t>Conclusiones</w:t>
+      </w:r>
+    </w:p>
+    <w:p>
+      <w:r>
+        <w:t>El análisis realizado, basado en la matriz FODA y en la identificación de fortalezas, oportunidades, debilidades y amenazas, permitió definir objetivos estratégicos coherentes y aplicables a corto, mediano y largo plazo. Las acciones propuestas integran recursos humanos, tecnológicos y de servicio con indicadores y responsables claros, lo que facilita su implementación y seguimiento.</w:t>
+      </w:r>
+    </w:p>
+    <w:p>
+      <w:r>
+        <w:t>La priorización de iniciativas por horizonte temporal busca equilibrar resultados rápidos con transformaciones sostenibles. Se enfatiza la formación y consolidación de talento, la modernización tecnológica y la expansión de la oferta de servicios como pilares para alcanzar la visión organizacional.</w:t>
+      </w:r>
+    </w:p>
+    <w:p>
+      <w:r>
+        <w:t>Se recomendó además la incorporación de mecanismos de evaluación periódica y la asignación explícita de recursos y responsables para cada actividad, reduciendo la ambigüedad y mejorando la rendición de cuentas. La planificación propuesta es realista en función de los recursos identificados y admite ajustes sobre la base de mediciones y retroalimentación.</w:t>
+      </w:r>
+    </w:p>
+    <w:p>
+      <w:r>
+        <w:t>En síntesis, el plan estratégico contiene elementos operativos y estratégicos compatibles con la misión y visión de Pangust Systems, y proporciona una hoja de ruta clara para la mejora organizacional y el crecimiento regional.</w:t>
+      </w:r>
+    </w:p>
+    <w:p>
+      <w:pPr>
+        <w:pStyle w:val="Ttulo1"/>
+      </w:pPr>
+      <w:r>
+        <w:t>Uso de la Inteligencia Artificial en la investigación</w:t>
+      </w:r>
+    </w:p>
+    <w:p>
+      <w:r>
+        <w:t>Durante el desarrollo de este trabajo se utilizó la Inteligencia Artificial como herramienta de apoyo en distintas fases del proceso investigativo. Las funciones de la IA incluyeron: búsqueda y síntesis de información de referencia, apoyo en la redacción inicial de secciones, sugerencias para la estructuración de objetivos y actividades, y asistencia en la generación del guion del video.</w:t>
+      </w:r>
+    </w:p>
+    <w:p>
+      <w:r>
+        <w:t>Es importante señalar que la IA se empleó como apoyo y no como sustituto del juicio académico. Todas las aportaciones generadas por la IA fueron revisadas, corregidas y contextualizadas por los integrantes del grupo para asegurar la precisión, coherencia teórica y cumplimiento de criterios académicos.</w:t>
+      </w:r>
+    </w:p>
+    <w:p>
+      <w:r>
+        <w:t>Asimismo, se atendieron consideraciones éticas: se verificó la veracidad de las fuentes recomendadas por la IA, se evitó la inclusión de contenido no atribuido y se respetaron las directrices institucionales sobre uso de tecnologías de asistencia.</w:t>
+      </w:r>
+    </w:p>
+    <w:p>
+      <w:r>
+        <w:t>El uso responsable de la IA permitió optimizar tiempos y mejorar la calidad formal del documento, facilitando la producción de borradores y la estandarización del formato APA 7; no obstante, la toma de decisiones estratégicas y la interpretación de resultados fue realizada por el equipo humano.</w:t>
+      </w:r>
+    </w:p>
     <w:sectPr>
       <w:pgSz w:w="12240" w:h="15840"/>
       <w:pgMar w:top="1440" w:right="1440" w:bottom="1440" w:left="1440" w:header="720" w:footer="720" w:gutter="0"/>

</xml_diff>

<commit_message>
actualizacion de la tarea 2
</commit_message>
<xml_diff>
--- a/Tarea 2/Guanga_Daniel_AnaDisSis_U2.docx
+++ b/Tarea 2/Guanga_Daniel_AnaDisSis_U2.docx
@@ -84,7 +84,6 @@
     <w:p>
       <w:pPr>
         <w:spacing w:line="360" w:lineRule="auto"/>
-        <w:jc w:val="center"/>
         <w:rPr>
           <w:rFonts w:ascii="Times New Roman" w:hAnsi="Times New Roman"/>
           <w:b/>
@@ -96,31 +95,6 @@
     <w:p>
       <w:pPr>
         <w:spacing w:line="360" w:lineRule="auto"/>
-        <w:jc w:val="center"/>
-        <w:rPr>
-          <w:rFonts w:ascii="Times New Roman" w:hAnsi="Times New Roman"/>
-          <w:b/>
-          <w:sz w:val="24"/>
-          <w:lang w:val="es-EC"/>
-        </w:rPr>
-      </w:pPr>
-    </w:p>
-    <w:p>
-      <w:pPr>
-        <w:spacing w:line="360" w:lineRule="auto"/>
-        <w:jc w:val="center"/>
-        <w:rPr>
-          <w:rFonts w:ascii="Times New Roman" w:hAnsi="Times New Roman"/>
-          <w:b/>
-          <w:sz w:val="24"/>
-          <w:lang w:val="es-EC"/>
-        </w:rPr>
-      </w:pPr>
-    </w:p>
-    <w:p>
-      <w:pPr>
-        <w:spacing w:line="360" w:lineRule="auto"/>
-        <w:jc w:val="center"/>
         <w:rPr>
           <w:rFonts w:ascii="Times New Roman" w:hAnsi="Times New Roman"/>
           <w:b/>
@@ -561,29 +535,7 @@
           <w:lang w:val="es-EC"/>
         </w:rPr>
         <w:lastRenderedPageBreak/>
-        <w:t xml:space="preserve">Abordar daremos nuestros </w:t>
-      </w:r>
-      <w:r>
-        <w:rPr>
-          <w:rFonts w:ascii="Times New Roman" w:hAnsi="Times New Roman" w:cs="Times New Roman"/>
-          <w:b/>
-          <w:bCs/>
-          <w:sz w:val="24"/>
-          <w:szCs w:val="24"/>
-          <w:lang w:val="es-EC"/>
-        </w:rPr>
-        <w:t xml:space="preserve">objetivos estratégicos en </w:t>
-      </w:r>
-      <w:r>
-        <w:rPr>
-          <w:rFonts w:ascii="Times New Roman" w:hAnsi="Times New Roman" w:cs="Times New Roman"/>
-          <w:b/>
-          <w:bCs/>
-          <w:sz w:val="24"/>
-          <w:szCs w:val="24"/>
-          <w:lang w:val="es-EC"/>
-        </w:rPr>
-        <w:t>las siguientes áreas</w:t>
+        <w:t>Abordar daremos nuestros objetivos estratégicos en las siguientes áreas</w:t>
       </w:r>
     </w:p>
     <w:tbl>
@@ -2917,14 +2869,324 @@
           <w:szCs w:val="24"/>
         </w:rPr>
       </w:pPr>
+    </w:p>
+    <w:p>
+      <w:pPr>
+        <w:rPr>
+          <w:rFonts w:ascii="Times New Roman" w:hAnsi="Times New Roman" w:cs="Times New Roman"/>
+          <w:sz w:val="24"/>
+          <w:szCs w:val="24"/>
+        </w:rPr>
+      </w:pPr>
+    </w:p>
+    <w:p>
+      <w:pPr>
+        <w:rPr>
+          <w:rFonts w:ascii="Times New Roman" w:hAnsi="Times New Roman" w:cs="Times New Roman"/>
+          <w:sz w:val="24"/>
+          <w:szCs w:val="24"/>
+        </w:rPr>
+      </w:pPr>
+    </w:p>
+    <w:p>
+      <w:pPr>
+        <w:rPr>
+          <w:rFonts w:ascii="Times New Roman" w:hAnsi="Times New Roman" w:cs="Times New Roman"/>
+          <w:sz w:val="24"/>
+          <w:szCs w:val="24"/>
+        </w:rPr>
+      </w:pPr>
+    </w:p>
+    <w:p>
+      <w:pPr>
+        <w:rPr>
+          <w:rFonts w:ascii="Times New Roman" w:hAnsi="Times New Roman" w:cs="Times New Roman"/>
+          <w:sz w:val="24"/>
+          <w:szCs w:val="24"/>
+        </w:rPr>
+      </w:pPr>
+    </w:p>
+    <w:p>
+      <w:pPr>
+        <w:rPr>
+          <w:rFonts w:ascii="Times New Roman" w:hAnsi="Times New Roman" w:cs="Times New Roman"/>
+          <w:sz w:val="24"/>
+          <w:szCs w:val="24"/>
+        </w:rPr>
+      </w:pPr>
+    </w:p>
+    <w:p>
+      <w:pPr>
+        <w:pStyle w:val="Ttulo1"/>
+        <w:numPr>
+          <w:ilvl w:val="0"/>
+          <w:numId w:val="10"/>
+        </w:numPr>
+        <w:rPr>
+          <w:color w:val="auto"/>
+          <w:sz w:val="24"/>
+          <w:szCs w:val="24"/>
+          <w:lang w:val="es-EC"/>
+        </w:rPr>
+      </w:pPr>
+      <w:r>
+        <w:rPr>
+          <w:color w:val="auto"/>
+          <w:sz w:val="24"/>
+          <w:szCs w:val="24"/>
+          <w:lang w:val="es-EC"/>
+        </w:rPr>
+        <w:lastRenderedPageBreak/>
+        <w:t>Conclusiones</w:t>
+      </w:r>
+    </w:p>
+    <w:p>
+      <w:pPr>
+        <w:rPr>
+          <w:lang w:val="es-EC"/>
+        </w:rPr>
+      </w:pPr>
+    </w:p>
+    <w:p>
+      <w:pPr>
+        <w:jc w:val="both"/>
+        <w:rPr>
+          <w:rFonts w:ascii="Times New Roman" w:hAnsi="Times New Roman" w:cs="Times New Roman"/>
+          <w:sz w:val="24"/>
+          <w:szCs w:val="24"/>
+          <w:lang w:val="es-EC"/>
+        </w:rPr>
+      </w:pPr>
       <w:r>
         <w:rPr>
           <w:rFonts w:ascii="Times New Roman" w:hAnsi="Times New Roman" w:cs="Times New Roman"/>
           <w:sz w:val="24"/>
           <w:szCs w:val="24"/>
+          <w:lang w:val="es-EC"/>
         </w:rPr>
-        <w:br w:type="page"/>
+        <w:t>El análisis que hicimos con la matriz FODA no fue solo un ejercicio teórico; nos sirvió para aterrizar metas que realmente podemos cumplir. Definimos objetivos para el corto, mediano y largo plazo, asegurándonos de que cada tarea tenga a alguien a cargo y una forma clara de medir el avance.</w:t>
       </w:r>
+    </w:p>
+    <w:p>
+      <w:pPr>
+        <w:jc w:val="both"/>
+        <w:rPr>
+          <w:rFonts w:ascii="Times New Roman" w:hAnsi="Times New Roman" w:cs="Times New Roman"/>
+          <w:sz w:val="24"/>
+          <w:szCs w:val="24"/>
+          <w:lang w:val="es-EC"/>
+        </w:rPr>
+      </w:pPr>
+      <w:r>
+        <w:rPr>
+          <w:rFonts w:ascii="Times New Roman" w:hAnsi="Times New Roman" w:cs="Times New Roman"/>
+          <w:sz w:val="24"/>
+          <w:szCs w:val="24"/>
+          <w:lang w:val="es-EC"/>
+        </w:rPr>
+        <w:t xml:space="preserve">La idea es avanzar de forma equilibrada: lograr victorias rápidas hoy mientras construimos cambios que duren mañana. Nos vamos a apoyar en tres pilares: potenciar el talento de nuestro equipo, modernizar nuestras herramientas y ampliar lo que ofrecemos. Además, para que nada quede en el aire, sugerimos revisiones periódicas y asignar recursos específicos a cada meta. Es un plan honesto, flexible y diseñado para que </w:t>
+      </w:r>
+      <w:proofErr w:type="spellStart"/>
+      <w:r>
+        <w:rPr>
+          <w:rFonts w:ascii="Times New Roman" w:hAnsi="Times New Roman" w:cs="Times New Roman"/>
+          <w:sz w:val="24"/>
+          <w:szCs w:val="24"/>
+          <w:lang w:val="es-EC"/>
+        </w:rPr>
+        <w:t>Pangust</w:t>
+      </w:r>
+      <w:proofErr w:type="spellEnd"/>
+      <w:r>
+        <w:rPr>
+          <w:rFonts w:ascii="Times New Roman" w:hAnsi="Times New Roman" w:cs="Times New Roman"/>
+          <w:sz w:val="24"/>
+          <w:szCs w:val="24"/>
+          <w:lang w:val="es-EC"/>
+        </w:rPr>
+        <w:t xml:space="preserve"> </w:t>
+      </w:r>
+      <w:proofErr w:type="spellStart"/>
+      <w:r>
+        <w:rPr>
+          <w:rFonts w:ascii="Times New Roman" w:hAnsi="Times New Roman" w:cs="Times New Roman"/>
+          <w:sz w:val="24"/>
+          <w:szCs w:val="24"/>
+          <w:lang w:val="es-EC"/>
+        </w:rPr>
+        <w:t>Systems</w:t>
+      </w:r>
+      <w:proofErr w:type="spellEnd"/>
+      <w:r>
+        <w:rPr>
+          <w:rFonts w:ascii="Times New Roman" w:hAnsi="Times New Roman" w:cs="Times New Roman"/>
+          <w:sz w:val="24"/>
+          <w:szCs w:val="24"/>
+          <w:lang w:val="es-EC"/>
+        </w:rPr>
+        <w:t xml:space="preserve"> crezca con paso firme en la región.</w:t>
+      </w:r>
+    </w:p>
+    <w:p>
+      <w:pPr>
+        <w:pStyle w:val="Ttulo1"/>
+        <w:ind w:firstLine="720"/>
+        <w:jc w:val="both"/>
+        <w:rPr>
+          <w:rFonts w:ascii="Times New Roman" w:hAnsi="Times New Roman" w:cs="Times New Roman"/>
+          <w:color w:val="auto"/>
+          <w:sz w:val="24"/>
+          <w:szCs w:val="24"/>
+          <w:lang w:val="es-EC"/>
+        </w:rPr>
+      </w:pPr>
+      <w:r>
+        <w:rPr>
+          <w:rFonts w:ascii="Times New Roman" w:hAnsi="Times New Roman" w:cs="Times New Roman"/>
+          <w:color w:val="auto"/>
+          <w:sz w:val="24"/>
+          <w:szCs w:val="24"/>
+          <w:lang w:val="es-EC"/>
+        </w:rPr>
+        <w:t>Uso de la Inteligencia Artificial en la investigación</w:t>
+      </w:r>
+    </w:p>
+    <w:p>
+      <w:pPr>
+        <w:rPr>
+          <w:lang w:val="es-EC"/>
+        </w:rPr>
+      </w:pPr>
+    </w:p>
+    <w:p>
+      <w:pPr>
+        <w:jc w:val="both"/>
+        <w:rPr>
+          <w:rFonts w:ascii="Times New Roman" w:hAnsi="Times New Roman" w:cs="Times New Roman"/>
+          <w:sz w:val="24"/>
+          <w:szCs w:val="24"/>
+          <w:lang w:val="es-EC"/>
+        </w:rPr>
+      </w:pPr>
+      <w:r>
+        <w:rPr>
+          <w:rFonts w:ascii="Times New Roman" w:hAnsi="Times New Roman" w:cs="Times New Roman"/>
+          <w:sz w:val="24"/>
+          <w:szCs w:val="24"/>
+          <w:lang w:val="es-EC"/>
+        </w:rPr>
+        <w:t>En el proceso de este trabajo, integramos la Inteligencia Artificial como una herramienta de apoyo, usándola principalmente para agilizar la búsqueda de referencias, estructurar borradores iniciales y organizar el guion del video.</w:t>
+      </w:r>
+    </w:p>
+    <w:p>
+      <w:pPr>
+        <w:jc w:val="both"/>
+        <w:rPr>
+          <w:rFonts w:ascii="Times New Roman" w:hAnsi="Times New Roman" w:cs="Times New Roman"/>
+          <w:sz w:val="24"/>
+          <w:szCs w:val="24"/>
+          <w:lang w:val="es-EC"/>
+        </w:rPr>
+      </w:pPr>
+      <w:r>
+        <w:rPr>
+          <w:rFonts w:ascii="Times New Roman" w:hAnsi="Times New Roman" w:cs="Times New Roman"/>
+          <w:sz w:val="24"/>
+          <w:szCs w:val="24"/>
+          <w:lang w:val="es-EC"/>
+        </w:rPr>
+        <w:t>Queremos ser claros: la IA no reemplazó nuestro criterio. Cada sugerencia o texto generado pasó por nuestro filtro; lo revisamos, lo ajustamos al contexto de la investigación y nos aseguramos de que cumpliera con los estándares académicos exigidos. Nos encargamos personalmente de verificar las fuentes y de que el análisis estratégico fuera 100% fruto de nuestra interpretación. En definitiva, la tecnología nos ayudó a pulir el formato y optimizar el tiempo, pero la esencia y las decisiones finales del proyecto son nuestras.</w:t>
+      </w:r>
+    </w:p>
+    <w:p>
+      <w:pPr>
+        <w:rPr>
+          <w:rFonts w:ascii="Times New Roman" w:hAnsi="Times New Roman" w:cs="Times New Roman"/>
+          <w:sz w:val="24"/>
+          <w:szCs w:val="24"/>
+          <w:lang w:val="es-EC"/>
+        </w:rPr>
+      </w:pPr>
+    </w:p>
+    <w:p>
+      <w:pPr>
+        <w:rPr>
+          <w:rFonts w:ascii="Times New Roman" w:hAnsi="Times New Roman" w:cs="Times New Roman"/>
+          <w:sz w:val="24"/>
+          <w:szCs w:val="24"/>
+          <w:lang w:val="es-EC"/>
+        </w:rPr>
+      </w:pPr>
+    </w:p>
+    <w:p>
+      <w:pPr>
+        <w:rPr>
+          <w:rFonts w:ascii="Times New Roman" w:hAnsi="Times New Roman" w:cs="Times New Roman"/>
+          <w:sz w:val="24"/>
+          <w:szCs w:val="24"/>
+          <w:lang w:val="es-EC"/>
+        </w:rPr>
+      </w:pPr>
+    </w:p>
+    <w:p>
+      <w:pPr>
+        <w:rPr>
+          <w:rFonts w:ascii="Times New Roman" w:hAnsi="Times New Roman" w:cs="Times New Roman"/>
+          <w:sz w:val="24"/>
+          <w:szCs w:val="24"/>
+          <w:lang w:val="es-EC"/>
+        </w:rPr>
+      </w:pPr>
+    </w:p>
+    <w:p>
+      <w:pPr>
+        <w:rPr>
+          <w:rFonts w:ascii="Times New Roman" w:hAnsi="Times New Roman" w:cs="Times New Roman"/>
+          <w:sz w:val="24"/>
+          <w:szCs w:val="24"/>
+          <w:lang w:val="es-EC"/>
+        </w:rPr>
+      </w:pPr>
+    </w:p>
+    <w:p>
+      <w:pPr>
+        <w:rPr>
+          <w:rFonts w:ascii="Times New Roman" w:hAnsi="Times New Roman" w:cs="Times New Roman"/>
+          <w:sz w:val="24"/>
+          <w:szCs w:val="24"/>
+          <w:lang w:val="es-EC"/>
+        </w:rPr>
+      </w:pPr>
+    </w:p>
+    <w:p>
+      <w:pPr>
+        <w:rPr>
+          <w:rFonts w:ascii="Times New Roman" w:hAnsi="Times New Roman" w:cs="Times New Roman"/>
+          <w:sz w:val="24"/>
+          <w:szCs w:val="24"/>
+          <w:lang w:val="es-EC"/>
+        </w:rPr>
+      </w:pPr>
+    </w:p>
+    <w:p>
+      <w:pPr>
+        <w:rPr>
+          <w:rFonts w:ascii="Times New Roman" w:hAnsi="Times New Roman" w:cs="Times New Roman"/>
+          <w:sz w:val="24"/>
+          <w:szCs w:val="24"/>
+          <w:lang w:val="es-EC"/>
+        </w:rPr>
+      </w:pPr>
+    </w:p>
+    <w:p>
+      <w:pPr>
+        <w:rPr>
+          <w:rFonts w:ascii="Times New Roman" w:hAnsi="Times New Roman" w:cs="Times New Roman"/>
+          <w:sz w:val="24"/>
+          <w:szCs w:val="24"/>
+          <w:lang w:val="es-EC"/>
+        </w:rPr>
+      </w:pPr>
     </w:p>
     <w:p>
       <w:pPr>
@@ -2991,65 +3253,28 @@
       </w:r>
     </w:p>
     <w:p>
+      <w:pPr>
+        <w:rPr>
+          <w:lang w:val="es-EC"/>
+        </w:rPr>
+      </w:pPr>
       <w:r>
+        <w:rPr>
+          <w:lang w:val="es-EC"/>
+        </w:rPr>
         <w:br w:type="page"/>
       </w:r>
     </w:p>
     <w:p>
       <w:pPr>
-        <w:pStyle w:val="Ttulo1"/>
+        <w:jc w:val="both"/>
+        <w:rPr>
+          <w:rFonts w:ascii="Times New Roman" w:hAnsi="Times New Roman" w:cs="Times New Roman"/>
+          <w:sz w:val="24"/>
+          <w:szCs w:val="24"/>
+          <w:lang w:val="es-EC"/>
+        </w:rPr>
       </w:pPr>
-      <w:r>
-        <w:t>Conclusiones</w:t>
-      </w:r>
-    </w:p>
-    <w:p>
-      <w:r>
-        <w:t>El análisis realizado, basado en la matriz FODA y en la identificación de fortalezas, oportunidades, debilidades y amenazas, permitió definir objetivos estratégicos coherentes y aplicables a corto, mediano y largo plazo. Las acciones propuestas integran recursos humanos, tecnológicos y de servicio con indicadores y responsables claros, lo que facilita su implementación y seguimiento.</w:t>
-      </w:r>
-    </w:p>
-    <w:p>
-      <w:r>
-        <w:t>La priorización de iniciativas por horizonte temporal busca equilibrar resultados rápidos con transformaciones sostenibles. Se enfatiza la formación y consolidación de talento, la modernización tecnológica y la expansión de la oferta de servicios como pilares para alcanzar la visión organizacional.</w:t>
-      </w:r>
-    </w:p>
-    <w:p>
-      <w:r>
-        <w:t>Se recomendó además la incorporación de mecanismos de evaluación periódica y la asignación explícita de recursos y responsables para cada actividad, reduciendo la ambigüedad y mejorando la rendición de cuentas. La planificación propuesta es realista en función de los recursos identificados y admite ajustes sobre la base de mediciones y retroalimentación.</w:t>
-      </w:r>
-    </w:p>
-    <w:p>
-      <w:r>
-        <w:t>En síntesis, el plan estratégico contiene elementos operativos y estratégicos compatibles con la misión y visión de Pangust Systems, y proporciona una hoja de ruta clara para la mejora organizacional y el crecimiento regional.</w:t>
-      </w:r>
-    </w:p>
-    <w:p>
-      <w:pPr>
-        <w:pStyle w:val="Ttulo1"/>
-      </w:pPr>
-      <w:r>
-        <w:t>Uso de la Inteligencia Artificial en la investigación</w:t>
-      </w:r>
-    </w:p>
-    <w:p>
-      <w:r>
-        <w:t>Durante el desarrollo de este trabajo se utilizó la Inteligencia Artificial como herramienta de apoyo en distintas fases del proceso investigativo. Las funciones de la IA incluyeron: búsqueda y síntesis de información de referencia, apoyo en la redacción inicial de secciones, sugerencias para la estructuración de objetivos y actividades, y asistencia en la generación del guion del video.</w:t>
-      </w:r>
-    </w:p>
-    <w:p>
-      <w:r>
-        <w:t>Es importante señalar que la IA se empleó como apoyo y no como sustituto del juicio académico. Todas las aportaciones generadas por la IA fueron revisadas, corregidas y contextualizadas por los integrantes del grupo para asegurar la precisión, coherencia teórica y cumplimiento de criterios académicos.</w:t>
-      </w:r>
-    </w:p>
-    <w:p>
-      <w:r>
-        <w:t>Asimismo, se atendieron consideraciones éticas: se verificó la veracidad de las fuentes recomendadas por la IA, se evitó la inclusión de contenido no atribuido y se respetaron las directrices institucionales sobre uso de tecnologías de asistencia.</w:t>
-      </w:r>
-    </w:p>
-    <w:p>
-      <w:r>
-        <w:t>El uso responsable de la IA permitió optimizar tiempos y mejorar la calidad formal del documento, facilitando la producción de borradores y la estandarización del formato APA 7; no obstante, la toma de decisiones estratégicas y la interpretación de resultados fue realizada por el equipo humano.</w:t>
-      </w:r>
     </w:p>
     <w:sectPr>
       <w:pgSz w:w="12240" w:h="15840"/>

</xml_diff>